<commit_message>
update: template Salary Increase
</commit_message>
<xml_diff>
--- a/public/templates/Addendum_Salary_Increase.docx
+++ b/public/templates/Addendum_Salary_Increase.docx
@@ -8,23 +8,23 @@
         <w:jc w:val="center"/>
         <w:rPr>
           <w:rFonts w:ascii="Aptos" w:eastAsia="Aptos" w:hAnsi="Aptos" w:cs="Aptos"/>
-          <w:sz w:val="40"/>
-          <w:szCs w:val="40"/>
+          <w:sz w:val="36"/>
+          <w:szCs w:val="36"/>
         </w:rPr>
       </w:pPr>
       <w:r>
         <w:rPr>
           <w:rFonts w:ascii="Aptos" w:eastAsia="Aptos" w:hAnsi="Aptos" w:cs="Aptos"/>
-          <w:sz w:val="40"/>
-          <w:szCs w:val="40"/>
+          <w:sz w:val="36"/>
+          <w:szCs w:val="36"/>
         </w:rPr>
         <w:t>ADDENDUM TO EMPLOYMENT CONTRACT: SALARY INCREASE</w:t>
       </w:r>
       <w:r>
         <w:rPr>
           <w:rFonts w:ascii="Aptos" w:eastAsia="Aptos" w:hAnsi="Aptos" w:cs="Aptos"/>
-          <w:sz w:val="40"/>
-          <w:szCs w:val="40"/>
+          <w:sz w:val="36"/>
+          <w:szCs w:val="36"/>
         </w:rPr>
         <w:br/>
       </w:r>
@@ -33,8 +33,8 @@
         <w:rPr>
           <w:rFonts w:ascii="Browallia New" w:eastAsia="Aptos" w:hAnsi="Browallia New" w:cs="Browallia New"/>
           <w:bCs/>
-          <w:sz w:val="44"/>
-          <w:szCs w:val="44"/>
+          <w:sz w:val="40"/>
+          <w:szCs w:val="40"/>
         </w:rPr>
         <w:t>บันทึกข้อตกลงแก้ไขเพิ่มเติมสัญญาจ้างงาน</w:t>
       </w:r>
@@ -43,8 +43,8 @@
         <w:rPr>
           <w:rFonts w:ascii="Aptos" w:eastAsia="Aptos" w:hAnsi="Aptos" w:cs="Aptos"/>
           <w:bCs/>
-          <w:sz w:val="44"/>
-          <w:szCs w:val="44"/>
+          <w:sz w:val="40"/>
+          <w:szCs w:val="40"/>
         </w:rPr>
         <w:t xml:space="preserve">: </w:t>
       </w:r>
@@ -53,8 +53,8 @@
         <w:rPr>
           <w:rFonts w:ascii="Browallia New" w:eastAsia="Aptos" w:hAnsi="Browallia New" w:cs="Browallia New"/>
           <w:bCs/>
-          <w:sz w:val="44"/>
-          <w:szCs w:val="44"/>
+          <w:sz w:val="40"/>
+          <w:szCs w:val="40"/>
         </w:rPr>
         <w:t>การปรับขึ้นเงินเดือน</w:t>
       </w:r>
@@ -68,8 +68,6 @@
           <w:rFonts w:ascii="Aptos" w:eastAsia="Aptos" w:hAnsi="Aptos" w:cs="Aptos"/>
           <w:b/>
           <w:bCs/>
-          <w:sz w:val="24"/>
-          <w:szCs w:val="24"/>
         </w:rPr>
       </w:pPr>
     </w:p>
@@ -81,8 +79,6 @@
           <w:rFonts w:ascii="Aptos" w:eastAsia="Aptos" w:hAnsi="Aptos" w:cs="Aptos"/>
           <w:b/>
           <w:bCs/>
-          <w:sz w:val="24"/>
-          <w:szCs w:val="24"/>
         </w:rPr>
       </w:pPr>
       <w:r>
@@ -90,8 +86,6 @@
           <w:rFonts w:ascii="Aptos" w:eastAsia="Aptos" w:hAnsi="Aptos" w:cs="Aptos"/>
           <w:b/>
           <w:bCs/>
-          <w:sz w:val="24"/>
-          <w:szCs w:val="24"/>
         </w:rPr>
         <w:t xml:space="preserve">Date / </w:t>
       </w:r>
@@ -101,8 +95,6 @@
           <w:rFonts w:ascii="Browallia New" w:eastAsia="Aptos" w:hAnsi="Browallia New" w:cs="Browallia New"/>
           <w:b/>
           <w:bCs/>
-          <w:sz w:val="24"/>
-          <w:szCs w:val="24"/>
         </w:rPr>
         <w:t>วันที่</w:t>
       </w:r>
@@ -112,10 +104,16 @@
           <w:rFonts w:ascii="Aptos" w:eastAsia="Aptos" w:hAnsi="Aptos" w:cs="Aptos"/>
           <w:b/>
           <w:bCs/>
-          <w:sz w:val="24"/>
-          <w:szCs w:val="24"/>
-        </w:rPr>
-        <w:t>: {{CURRENT_DATE}}</w:t>
+        </w:rPr>
+        <w:t xml:space="preserve">: </w:t>
+      </w:r>
+      <w:r>
+        <w:rPr>
+          <w:rFonts w:ascii="Aptos" w:eastAsia="Aptos" w:hAnsi="Aptos" w:cs="Aptos"/>
+          <w:b/>
+          <w:bCs/>
+        </w:rPr>
+        <w:t>{{NEW_START_DATE}}</w:t>
       </w:r>
     </w:p>
     <w:p>
@@ -124,8 +122,6 @@
         <w:jc w:val="both"/>
         <w:rPr>
           <w:rFonts w:ascii="Aptos" w:eastAsia="Aptos" w:hAnsi="Aptos" w:cs="Aptos"/>
-          <w:sz w:val="24"/>
-          <w:szCs w:val="24"/>
         </w:rPr>
       </w:pPr>
       <w:r>
@@ -133,8 +129,6 @@
           <w:rFonts w:ascii="Aptos" w:eastAsia="Aptos" w:hAnsi="Aptos" w:cs="Aptos"/>
           <w:b/>
           <w:bCs/>
-          <w:sz w:val="24"/>
-          <w:szCs w:val="24"/>
         </w:rPr>
         <w:t xml:space="preserve">Employee Name / </w:t>
       </w:r>
@@ -144,8 +138,6 @@
           <w:rFonts w:ascii="Browallia New" w:eastAsia="Aptos" w:hAnsi="Browallia New" w:cs="Browallia New"/>
           <w:b/>
           <w:bCs/>
-          <w:sz w:val="24"/>
-          <w:szCs w:val="24"/>
         </w:rPr>
         <w:t>ชื่อพนักงาน</w:t>
       </w:r>
@@ -155,8 +147,6 @@
           <w:rFonts w:ascii="Aptos" w:eastAsia="Aptos" w:hAnsi="Aptos" w:cs="Aptos"/>
           <w:b/>
           <w:bCs/>
-          <w:sz w:val="24"/>
-          <w:szCs w:val="24"/>
         </w:rPr>
         <w:t>: {{STAFF_NAME}}</w:t>
       </w:r>
@@ -166,15 +156,11 @@
         <w:spacing w:before="240" w:after="240"/>
         <w:rPr>
           <w:rFonts w:ascii="Aptos" w:eastAsia="Aptos" w:hAnsi="Aptos" w:cs="Aptos"/>
-          <w:sz w:val="24"/>
-          <w:szCs w:val="24"/>
         </w:rPr>
       </w:pPr>
       <w:r>
         <w:rPr>
           <w:rFonts w:ascii="Aptos" w:eastAsia="Aptos" w:hAnsi="Aptos" w:cs="Aptos"/>
-          <w:sz w:val="24"/>
-          <w:szCs w:val="24"/>
         </w:rPr>
         <w:t>This document serves as an addendum to the Employment Contract originally starting on {{ORIGINAL_START_DATE}}. Both parties agree to the following changes, effective as of {{NEW_START_DATE}}:</w:t>
       </w:r>
@@ -184,33 +170,25 @@
         <w:spacing w:before="240" w:after="240"/>
         <w:rPr>
           <w:rFonts w:ascii="Aptos" w:eastAsia="Aptos" w:hAnsi="Aptos" w:cs="Aptos"/>
-          <w:sz w:val="24"/>
-          <w:szCs w:val="24"/>
         </w:rPr>
       </w:pPr>
       <w:r>
         <w:rPr>
           <w:rFonts w:ascii="Browallia New" w:eastAsia="Aptos" w:hAnsi="Browallia New" w:cs="Browallia New"/>
-          <w:sz w:val="24"/>
-          <w:szCs w:val="24"/>
-        </w:rPr>
-        <w:t>บันทึกฉบับนี้ถือเป็นส่วนหนึ่งของสัญญาจ้างงานที่เริ่มต้น</w:t>
+        </w:rPr>
+        <w:t>บันทึกฉบับนี้ถือเป็นส่วนหนึ่งของสัญญา</w:t>
       </w:r>
       <w:proofErr w:type="spellStart"/>
       <w:r>
         <w:rPr>
           <w:rFonts w:ascii="Browallia New" w:eastAsia="Aptos" w:hAnsi="Browallia New" w:cs="Browallia New"/>
-          <w:sz w:val="24"/>
-          <w:szCs w:val="24"/>
-        </w:rPr>
-        <w:t>เมื่อวันที่</w:t>
+        </w:rPr>
+        <w:t>จ้างงานที่เริ่มต้นเมื่อวันที่</w:t>
       </w:r>
       <w:proofErr w:type="spellEnd"/>
       <w:r>
         <w:rPr>
           <w:rFonts w:ascii="Aptos" w:eastAsia="Aptos" w:hAnsi="Aptos" w:cs="Aptos"/>
-          <w:sz w:val="24"/>
-          <w:szCs w:val="24"/>
         </w:rPr>
         <w:t xml:space="preserve">{{ORIGINAL_START_DATE}} </w:t>
       </w:r>
@@ -218,8 +196,6 @@
       <w:r>
         <w:rPr>
           <w:rFonts w:ascii="Browallia New" w:eastAsia="Aptos" w:hAnsi="Browallia New" w:cs="Browallia New"/>
-          <w:sz w:val="24"/>
-          <w:szCs w:val="24"/>
         </w:rPr>
         <w:t>โดยทั้งสองฝ่ายตกลงแก้ไขเพิ่มเติมดังนี้</w:t>
       </w:r>
@@ -227,8 +203,6 @@
       <w:r>
         <w:rPr>
           <w:rFonts w:ascii="Aptos" w:eastAsia="Aptos" w:hAnsi="Aptos" w:cs="Aptos"/>
-          <w:sz w:val="24"/>
-          <w:szCs w:val="24"/>
         </w:rPr>
         <w:t xml:space="preserve"> </w:t>
       </w:r>
@@ -236,8 +210,6 @@
       <w:r>
         <w:rPr>
           <w:rFonts w:ascii="Browallia New" w:eastAsia="Aptos" w:hAnsi="Browallia New" w:cs="Browallia New"/>
-          <w:sz w:val="24"/>
-          <w:szCs w:val="24"/>
         </w:rPr>
         <w:t>ซึ่งมีผลบังคับใช้ตั้งแต่วันที่</w:t>
       </w:r>
@@ -245,8 +217,6 @@
       <w:r>
         <w:rPr>
           <w:rFonts w:ascii="Aptos" w:eastAsia="Aptos" w:hAnsi="Aptos" w:cs="Aptos"/>
-          <w:sz w:val="24"/>
-          <w:szCs w:val="24"/>
         </w:rPr>
         <w:t xml:space="preserve"> {{NEW_START_DATE}}:</w:t>
       </w:r>
@@ -256,10 +226,6 @@
         <w:spacing w:before="240" w:after="240"/>
         <w:rPr>
           <w:rFonts w:ascii="Aptos" w:eastAsia="Aptos" w:hAnsi="Aptos" w:cs="Aptos"/>
-          <w:b/>
-          <w:bCs/>
-          <w:sz w:val="24"/>
-          <w:szCs w:val="24"/>
         </w:rPr>
       </w:pPr>
       <w:r>
@@ -267,8 +233,6 @@
           <w:rFonts w:ascii="Aptos" w:eastAsia="Aptos" w:hAnsi="Aptos" w:cs="Aptos"/>
           <w:b/>
           <w:bCs/>
-          <w:sz w:val="24"/>
-          <w:szCs w:val="24"/>
         </w:rPr>
         <w:t xml:space="preserve">1. Job Title &amp; Scope / </w:t>
       </w:r>
@@ -278,8 +242,6 @@
           <w:rFonts w:ascii="Browallia New" w:eastAsia="Aptos" w:hAnsi="Browallia New" w:cs="Browallia New"/>
           <w:b/>
           <w:bCs/>
-          <w:sz w:val="24"/>
-          <w:szCs w:val="24"/>
         </w:rPr>
         <w:t>ตำแหน่งงานและขอบเขตหน้าที่</w:t>
       </w:r>
@@ -289,26 +251,20 @@
           <w:rFonts w:ascii="Aptos" w:eastAsia="Aptos" w:hAnsi="Aptos" w:cs="Aptos"/>
           <w:b/>
           <w:bCs/>
-          <w:sz w:val="24"/>
-          <w:szCs w:val="24"/>
         </w:rPr>
         <w:t>:</w:t>
       </w:r>
-    </w:p>
-    <w:p>
-      <w:pPr>
-        <w:spacing w:before="240" w:after="240"/>
+      <w:r>
         <w:rPr>
           <w:rFonts w:ascii="Aptos" w:eastAsia="Aptos" w:hAnsi="Aptos" w:cs="Aptos"/>
-          <w:sz w:val="24"/>
-          <w:szCs w:val="24"/>
-        </w:rPr>
-      </w:pPr>
+          <w:b/>
+          <w:bCs/>
+        </w:rPr>
+        <w:br/>
+      </w:r>
       <w:r>
         <w:rPr>
           <w:rFonts w:ascii="Aptos" w:eastAsia="Aptos" w:hAnsi="Aptos" w:cs="Aptos"/>
-          <w:sz w:val="24"/>
-          <w:szCs w:val="24"/>
         </w:rPr>
         <w:t>The Employee's job title remains {{JOB_TITLE}} in the {{DEPARTMENT}} department. The scope of work and daily responsibilities remain unchanged.</w:t>
       </w:r>
@@ -318,16 +274,12 @@
         <w:spacing w:before="240" w:after="240"/>
         <w:rPr>
           <w:rFonts w:ascii="Aptos" w:eastAsia="Aptos" w:hAnsi="Aptos" w:cs="Aptos"/>
-          <w:sz w:val="24"/>
-          <w:szCs w:val="24"/>
         </w:rPr>
       </w:pPr>
       <w:proofErr w:type="spellStart"/>
       <w:r>
         <w:rPr>
           <w:rFonts w:ascii="Browallia New" w:eastAsia="Aptos" w:hAnsi="Browallia New" w:cs="Browallia New"/>
-          <w:sz w:val="24"/>
-          <w:szCs w:val="24"/>
         </w:rPr>
         <w:t>ตำแหน่งงานของพนักงานยังคงเป็น</w:t>
       </w:r>
@@ -335,8 +287,6 @@
       <w:r>
         <w:rPr>
           <w:rFonts w:ascii="Aptos" w:eastAsia="Aptos" w:hAnsi="Aptos" w:cs="Aptos"/>
-          <w:sz w:val="24"/>
-          <w:szCs w:val="24"/>
         </w:rPr>
         <w:t xml:space="preserve"> {{JOB_TITLE}} </w:t>
       </w:r>
@@ -344,8 +294,6 @@
       <w:r>
         <w:rPr>
           <w:rFonts w:ascii="Browallia New" w:eastAsia="Aptos" w:hAnsi="Browallia New" w:cs="Browallia New"/>
-          <w:sz w:val="24"/>
-          <w:szCs w:val="24"/>
         </w:rPr>
         <w:t>ในแผนก</w:t>
       </w:r>
@@ -353,27 +301,21 @@
       <w:r>
         <w:rPr>
           <w:rFonts w:ascii="Aptos" w:eastAsia="Aptos" w:hAnsi="Aptos" w:cs="Aptos"/>
-          <w:sz w:val="24"/>
-          <w:szCs w:val="24"/>
         </w:rPr>
         <w:t xml:space="preserve"> {{DEPARTMENT}} </w:t>
       </w:r>
       <w:r>
         <w:rPr>
           <w:rFonts w:ascii="Browallia New" w:eastAsia="Aptos" w:hAnsi="Browallia New" w:cs="Browallia New"/>
-          <w:sz w:val="24"/>
-          <w:szCs w:val="24"/>
-        </w:rPr>
-        <w:t>ขอบเขตการทำงานและความ</w:t>
+        </w:rPr>
+        <w:t>ขอบเขต</w:t>
       </w:r>
       <w:proofErr w:type="spellStart"/>
       <w:r>
         <w:rPr>
           <w:rFonts w:ascii="Browallia New" w:eastAsia="Aptos" w:hAnsi="Browallia New" w:cs="Browallia New"/>
-          <w:sz w:val="24"/>
-          <w:szCs w:val="24"/>
-        </w:rPr>
-        <w:t>รับผิดชอบประจำวันยังคงเดิมไม่มีการเปลี่ยนแปลง</w:t>
+        </w:rPr>
+        <w:t>การทำงานและความรับผิดชอบประจำวันยังคงเดิมไม่มีการเปลี่ยนแปลง</w:t>
       </w:r>
       <w:proofErr w:type="spellEnd"/>
     </w:p>
@@ -384,8 +326,6 @@
           <w:rFonts w:ascii="Aptos" w:eastAsia="Aptos" w:hAnsi="Aptos" w:cs="Aptos"/>
           <w:b/>
           <w:bCs/>
-          <w:sz w:val="24"/>
-          <w:szCs w:val="24"/>
         </w:rPr>
       </w:pPr>
       <w:r>
@@ -393,8 +333,6 @@
           <w:rFonts w:ascii="Aptos" w:eastAsia="Aptos" w:hAnsi="Aptos" w:cs="Aptos"/>
           <w:b/>
           <w:bCs/>
-          <w:sz w:val="24"/>
-          <w:szCs w:val="24"/>
         </w:rPr>
         <w:t xml:space="preserve">2. Compensation / </w:t>
       </w:r>
@@ -404,8 +342,6 @@
           <w:rFonts w:ascii="Browallia New" w:eastAsia="Aptos" w:hAnsi="Browallia New" w:cs="Browallia New"/>
           <w:b/>
           <w:bCs/>
-          <w:sz w:val="24"/>
-          <w:szCs w:val="24"/>
         </w:rPr>
         <w:t>ค่าจ้าง</w:t>
       </w:r>
@@ -415,26 +351,20 @@
           <w:rFonts w:ascii="Aptos" w:eastAsia="Aptos" w:hAnsi="Aptos" w:cs="Aptos"/>
           <w:b/>
           <w:bCs/>
-          <w:sz w:val="24"/>
-          <w:szCs w:val="24"/>
         </w:rPr>
         <w:t>:</w:t>
       </w:r>
-    </w:p>
-    <w:p>
-      <w:pPr>
-        <w:spacing w:before="240" w:after="240"/>
+      <w:r>
         <w:rPr>
           <w:rFonts w:ascii="Aptos" w:eastAsia="Aptos" w:hAnsi="Aptos" w:cs="Aptos"/>
-          <w:sz w:val="24"/>
-          <w:szCs w:val="24"/>
-        </w:rPr>
-      </w:pPr>
+          <w:b/>
+          <w:bCs/>
+        </w:rPr>
+        <w:br/>
+      </w:r>
       <w:r>
         <w:rPr>
           <w:rFonts w:ascii="Aptos" w:eastAsia="Aptos" w:hAnsi="Aptos" w:cs="Aptos"/>
-          <w:sz w:val="24"/>
-          <w:szCs w:val="24"/>
         </w:rPr>
         <w:t>Due to the Employee's performance, the new salary shall be {{NEW_SALARY_EN}} ({{NEW_SALARY}}) Baht per month.</w:t>
       </w:r>
@@ -444,16 +374,12 @@
         <w:spacing w:before="240" w:after="240"/>
         <w:rPr>
           <w:rFonts w:ascii="Aptos" w:eastAsia="Aptos" w:hAnsi="Aptos" w:cs="Aptos"/>
-          <w:sz w:val="24"/>
-          <w:szCs w:val="24"/>
         </w:rPr>
       </w:pPr>
       <w:proofErr w:type="spellStart"/>
       <w:r>
         <w:rPr>
           <w:rFonts w:ascii="Browallia New" w:eastAsia="Aptos" w:hAnsi="Browallia New" w:cs="Browallia New"/>
-          <w:sz w:val="24"/>
-          <w:szCs w:val="24"/>
         </w:rPr>
         <w:t>เนื่องจากผลการปฏิบัติงานของพนักงาน</w:t>
       </w:r>
@@ -461,8 +387,6 @@
       <w:r>
         <w:rPr>
           <w:rFonts w:ascii="Aptos" w:eastAsia="Aptos" w:hAnsi="Aptos" w:cs="Aptos"/>
-          <w:sz w:val="24"/>
-          <w:szCs w:val="24"/>
         </w:rPr>
         <w:t xml:space="preserve"> </w:t>
       </w:r>
@@ -470,8 +394,6 @@
       <w:r>
         <w:rPr>
           <w:rFonts w:ascii="Browallia New" w:eastAsia="Aptos" w:hAnsi="Browallia New" w:cs="Browallia New"/>
-          <w:sz w:val="24"/>
-          <w:szCs w:val="24"/>
         </w:rPr>
         <w:t>ค่าจ้างใหม่จะปรับเป็น</w:t>
       </w:r>
@@ -479,8 +401,6 @@
       <w:r>
         <w:rPr>
           <w:rFonts w:ascii="Aptos" w:eastAsia="Aptos" w:hAnsi="Aptos" w:cs="Aptos"/>
-          <w:sz w:val="24"/>
-          <w:szCs w:val="24"/>
         </w:rPr>
         <w:t xml:space="preserve"> {{NEW_SALARY_TH}} ({{NEW_SALARY}}) </w:t>
       </w:r>
@@ -488,8 +408,6 @@
       <w:r>
         <w:rPr>
           <w:rFonts w:ascii="Browallia New" w:eastAsia="Aptos" w:hAnsi="Browallia New" w:cs="Browallia New"/>
-          <w:sz w:val="24"/>
-          <w:szCs w:val="24"/>
         </w:rPr>
         <w:t>บาทต่อเดือน</w:t>
       </w:r>
@@ -500,15 +418,11 @@
         <w:spacing w:before="240" w:after="240"/>
         <w:rPr>
           <w:rFonts w:ascii="Aptos" w:eastAsia="Aptos" w:hAnsi="Aptos" w:cs="Aptos"/>
-          <w:sz w:val="24"/>
-          <w:szCs w:val="24"/>
         </w:rPr>
       </w:pPr>
       <w:r>
         <w:rPr>
           <w:rFonts w:ascii="Aptos" w:eastAsia="Aptos" w:hAnsi="Aptos" w:cs="Aptos"/>
-          <w:sz w:val="24"/>
-          <w:szCs w:val="24"/>
         </w:rPr>
         <w:t>All other benefits, including the Daily Allowance and Attendance Bonus, remain in full effect according to the original contract.</w:t>
       </w:r>
@@ -518,16 +432,12 @@
         <w:spacing w:before="240" w:after="240"/>
         <w:rPr>
           <w:rFonts w:ascii="Browallia New" w:eastAsia="Aptos" w:hAnsi="Browallia New" w:cs="Browallia New"/>
-          <w:sz w:val="24"/>
-          <w:szCs w:val="24"/>
         </w:rPr>
       </w:pPr>
       <w:proofErr w:type="spellStart"/>
       <w:r>
         <w:rPr>
           <w:rFonts w:ascii="Browallia New" w:eastAsia="Aptos" w:hAnsi="Browallia New" w:cs="Browallia New"/>
-          <w:sz w:val="24"/>
-          <w:szCs w:val="24"/>
         </w:rPr>
         <w:t>สวัสดิการอื่นๆ</w:t>
       </w:r>
@@ -535,8 +445,6 @@
       <w:r>
         <w:rPr>
           <w:rFonts w:ascii="Aptos" w:eastAsia="Aptos" w:hAnsi="Aptos" w:cs="Aptos"/>
-          <w:sz w:val="24"/>
-          <w:szCs w:val="24"/>
         </w:rPr>
         <w:t xml:space="preserve"> </w:t>
       </w:r>
@@ -544,8 +452,6 @@
       <w:r>
         <w:rPr>
           <w:rFonts w:ascii="Browallia New" w:eastAsia="Aptos" w:hAnsi="Browallia New" w:cs="Browallia New"/>
-          <w:sz w:val="24"/>
-          <w:szCs w:val="24"/>
         </w:rPr>
         <w:t>ทั้งหมด</w:t>
       </w:r>
@@ -553,8 +459,6 @@
       <w:r>
         <w:rPr>
           <w:rFonts w:ascii="Aptos" w:eastAsia="Aptos" w:hAnsi="Aptos" w:cs="Aptos"/>
-          <w:sz w:val="24"/>
-          <w:szCs w:val="24"/>
         </w:rPr>
         <w:t xml:space="preserve"> </w:t>
       </w:r>
@@ -562,8 +466,6 @@
       <w:r>
         <w:rPr>
           <w:rFonts w:ascii="Browallia New" w:eastAsia="Aptos" w:hAnsi="Browallia New" w:cs="Browallia New"/>
-          <w:sz w:val="24"/>
-          <w:szCs w:val="24"/>
         </w:rPr>
         <w:t>รวมถึงค่าเบี้ยเลี้ยงรายวันและเงินโบนัสการเข้างาน</w:t>
       </w:r>
@@ -571,8 +473,6 @@
       <w:r>
         <w:rPr>
           <w:rFonts w:ascii="Aptos" w:eastAsia="Aptos" w:hAnsi="Aptos" w:cs="Aptos"/>
-          <w:sz w:val="24"/>
-          <w:szCs w:val="24"/>
         </w:rPr>
         <w:t xml:space="preserve"> </w:t>
       </w:r>
@@ -580,272 +480,248 @@
       <w:r>
         <w:rPr>
           <w:rFonts w:ascii="Browallia New" w:eastAsia="Aptos" w:hAnsi="Browallia New" w:cs="Browallia New"/>
-          <w:sz w:val="24"/>
-          <w:szCs w:val="24"/>
         </w:rPr>
         <w:t>ยังคงมีผลบังคับใช้อย่างสมบูรณ์ตามสัญญาเดิม</w:t>
       </w:r>
       <w:proofErr w:type="spellEnd"/>
     </w:p>
+    <w:tbl>
+      <w:tblPr>
+        <w:tblW w:w="0" w:type="auto"/>
+        <w:tblLook w:val="04A0" w:firstRow="1" w:lastRow="0" w:firstColumn="1" w:lastColumn="0" w:noHBand="0" w:noVBand="1"/>
+      </w:tblPr>
+      <w:tblGrid>
+        <w:gridCol w:w="4320"/>
+        <w:gridCol w:w="4320"/>
+      </w:tblGrid>
+      <w:tr>
+        <w:tc>
+          <w:tcPr>
+            <w:tcW w:w="4320" w:type="dxa"/>
+            <w:hideMark/>
+          </w:tcPr>
+          <w:p>
+            <w:pPr>
+              <w:spacing w:after="240" w:line="276" w:lineRule="auto"/>
+              <w:rPr>
+                <w:rFonts w:ascii="Aptos" w:eastAsia="Aptos" w:hAnsi="Aptos" w:cs="Aptos"/>
+                <w:b/>
+                <w:bCs/>
+                <w:color w:val="1B1C1D"/>
+              </w:rPr>
+            </w:pPr>
+            <w:r>
+              <w:rPr>
+                <w:rFonts w:ascii="Aptos" w:eastAsia="Aptos" w:hAnsi="Aptos" w:cs="Aptos"/>
+                <w:b/>
+                <w:bCs/>
+                <w:color w:val="1B1C1D"/>
+              </w:rPr>
+              <w:t xml:space="preserve">Employee Signature / </w:t>
+            </w:r>
+            <w:proofErr w:type="spellStart"/>
+            <w:r>
+              <w:rPr>
+                <w:rFonts w:ascii="Browallia New" w:eastAsia="Aptos" w:hAnsi="Browallia New" w:cs="Browallia New"/>
+                <w:b/>
+                <w:bCs/>
+                <w:color w:val="1B1C1D"/>
+              </w:rPr>
+              <w:t>ลายมือชื่อลูกจ้าง</w:t>
+            </w:r>
+            <w:proofErr w:type="spellEnd"/>
+            <w:r>
+              <w:rPr>
+                <w:rFonts w:ascii="Aptos" w:eastAsia="Aptos" w:hAnsi="Aptos" w:cs="Aptos"/>
+                <w:b/>
+                <w:bCs/>
+                <w:color w:val="1B1C1D"/>
+              </w:rPr>
+              <w:t>:</w:t>
+            </w:r>
+            <w:r>
+              <w:rPr>
+                <w:rFonts w:ascii="Aptos" w:eastAsia="Aptos" w:hAnsi="Aptos" w:cs="Aptos"/>
+                <w:b/>
+                <w:bCs/>
+                <w:color w:val="1B1C1D"/>
+              </w:rPr>
+              <w:br/>
+            </w:r>
+          </w:p>
+          <w:p>
+            <w:pPr>
+              <w:spacing w:after="240" w:line="276" w:lineRule="auto"/>
+              <w:rPr>
+                <w:rFonts w:ascii="Aptos" w:eastAsia="Aptos" w:hAnsi="Aptos" w:cs="Aptos"/>
+                <w:b/>
+                <w:bCs/>
+                <w:color w:val="1B1C1D"/>
+              </w:rPr>
+            </w:pPr>
+            <w:r>
+              <w:rPr>
+                <w:rFonts w:ascii="Aptos" w:eastAsia="Aptos" w:hAnsi="Aptos" w:cs="Aptos"/>
+                <w:b/>
+                <w:bCs/>
+                <w:color w:val="1B1C1D"/>
+              </w:rPr>
+              <w:br/>
+              <w:t>___________________________</w:t>
+            </w:r>
+            <w:r>
+              <w:rPr>
+                <w:rFonts w:ascii="Aptos" w:eastAsia="Aptos" w:hAnsi="Aptos" w:cs="Aptos"/>
+                <w:b/>
+                <w:bCs/>
+                <w:color w:val="1B1C1D"/>
+              </w:rPr>
+              <w:br/>
+              <w:t>{{STAFF_NAME}}</w:t>
+            </w:r>
+          </w:p>
+        </w:tc>
+        <w:tc>
+          <w:tcPr>
+            <w:tcW w:w="4320" w:type="dxa"/>
+            <w:hideMark/>
+          </w:tcPr>
+          <w:p>
+            <w:pPr>
+              <w:spacing w:after="240" w:line="276" w:lineRule="auto"/>
+              <w:rPr>
+                <w:rFonts w:ascii="Aptos" w:eastAsia="Aptos" w:hAnsi="Aptos" w:cs="Aptos"/>
+                <w:b/>
+                <w:bCs/>
+                <w:color w:val="1B1C1D"/>
+              </w:rPr>
+            </w:pPr>
+            <w:r>
+              <w:rPr>
+                <w:rFonts w:ascii="Aptos" w:eastAsia="Aptos" w:hAnsi="Aptos" w:cs="Aptos"/>
+                <w:b/>
+                <w:bCs/>
+                <w:color w:val="1B1C1D"/>
+              </w:rPr>
+              <w:t xml:space="preserve">Employer Signature / </w:t>
+            </w:r>
+            <w:proofErr w:type="spellStart"/>
+            <w:r>
+              <w:rPr>
+                <w:rFonts w:ascii="Browallia New" w:eastAsia="Aptos" w:hAnsi="Browallia New" w:cs="Browallia New"/>
+                <w:b/>
+                <w:bCs/>
+                <w:color w:val="1B1C1D"/>
+              </w:rPr>
+              <w:t>ลายมือชื่อนายจ้าง</w:t>
+            </w:r>
+            <w:proofErr w:type="spellEnd"/>
+            <w:r>
+              <w:rPr>
+                <w:rFonts w:ascii="Aptos" w:eastAsia="Aptos" w:hAnsi="Aptos" w:cs="Aptos"/>
+                <w:b/>
+                <w:bCs/>
+                <w:color w:val="1B1C1D"/>
+              </w:rPr>
+              <w:t>:</w:t>
+            </w:r>
+            <w:r>
+              <w:rPr>
+                <w:rFonts w:ascii="Aptos" w:eastAsia="Aptos" w:hAnsi="Aptos" w:cs="Aptos"/>
+                <w:b/>
+                <w:bCs/>
+                <w:color w:val="1B1C1D"/>
+              </w:rPr>
+              <w:br/>
+              <w:t>{{#DIRECTORS}}</w:t>
+            </w:r>
+          </w:p>
+          <w:p>
+            <w:pPr>
+              <w:spacing w:after="240" w:line="276" w:lineRule="auto"/>
+              <w:rPr>
+                <w:rFonts w:ascii="Aptos" w:eastAsia="Aptos" w:hAnsi="Aptos" w:cs="Aptos"/>
+                <w:b/>
+                <w:bCs/>
+                <w:color w:val="1B1C1D"/>
+              </w:rPr>
+            </w:pPr>
+            <w:r>
+              <w:rPr>
+                <w:rFonts w:ascii="Aptos" w:eastAsia="Aptos" w:hAnsi="Aptos" w:cs="Aptos"/>
+                <w:b/>
+                <w:bCs/>
+                <w:color w:val="1B1C1D"/>
+              </w:rPr>
+              <w:br/>
+              <w:t>___________________________</w:t>
+            </w:r>
+            <w:r>
+              <w:rPr>
+                <w:rFonts w:ascii="Aptos" w:eastAsia="Aptos" w:hAnsi="Aptos" w:cs="Aptos"/>
+                <w:b/>
+                <w:bCs/>
+                <w:color w:val="1B1C1D"/>
+              </w:rPr>
+              <w:br/>
+              <w:t>{{NAME}}</w:t>
+            </w:r>
+            <w:r>
+              <w:rPr>
+                <w:rFonts w:ascii="Aptos" w:eastAsia="Aptos" w:hAnsi="Aptos" w:cs="Aptos"/>
+                <w:b/>
+                <w:bCs/>
+                <w:color w:val="1B1C1D"/>
+              </w:rPr>
+              <w:br/>
+            </w:r>
+            <w:r>
+              <w:rPr>
+                <w:rFonts w:ascii="Aptos" w:eastAsia="Aptos" w:hAnsi="Aptos" w:cs="Aptos"/>
+                <w:color w:val="1B1C1D"/>
+              </w:rPr>
+              <w:t>(Authorized Director)</w:t>
+            </w:r>
+            <w:r>
+              <w:rPr>
+                <w:rFonts w:ascii="Aptos" w:eastAsia="Aptos" w:hAnsi="Aptos" w:cs="Aptos"/>
+                <w:b/>
+                <w:bCs/>
+                <w:color w:val="1B1C1D"/>
+              </w:rPr>
+              <w:br/>
+              <w:t>{{/DIRECTORS}}</w:t>
+            </w:r>
+            <w:r>
+              <w:rPr>
+                <w:rFonts w:ascii="Aptos" w:eastAsia="Aptos" w:hAnsi="Aptos" w:cs="Aptos"/>
+                <w:b/>
+                <w:bCs/>
+                <w:color w:val="1B1C1D"/>
+              </w:rPr>
+              <w:br/>
+            </w:r>
+          </w:p>
+        </w:tc>
+      </w:tr>
+    </w:tbl>
     <w:p>
       <w:pPr>
-        <w:spacing w:after="240" w:line="276" w:lineRule="auto"/>
+        <w:spacing w:before="240" w:after="240"/>
         <w:rPr>
           <w:rFonts w:ascii="Aptos" w:eastAsia="Aptos" w:hAnsi="Aptos" w:cs="Aptos"/>
-          <w:b/>
-          <w:bCs/>
-          <w:color w:val="1B1C1D"/>
-        </w:rPr>
-      </w:pPr>
-      <w:r>
-        <w:rPr>
-          <w:rFonts w:ascii="Aptos" w:eastAsia="Aptos" w:hAnsi="Aptos" w:cs="Aptos"/>
-          <w:b/>
-          <w:bCs/>
-        </w:rPr>
-        <w:t>Employee</w:t>
-      </w:r>
-      <w:r>
-        <w:rPr>
-          <w:rFonts w:ascii="Aptos" w:eastAsia="Aptos" w:hAnsi="Aptos" w:cs="Aptos"/>
-          <w:b/>
-          <w:bCs/>
-        </w:rPr>
-        <w:br/>
-      </w:r>
-      <w:r>
-        <w:rPr>
-          <w:rFonts w:ascii="Aptos" w:eastAsia="Aptos" w:hAnsi="Aptos" w:cs="Aptos"/>
-          <w:b/>
-          <w:bCs/>
-        </w:rPr>
-        <w:br/>
-      </w:r>
-      <w:proofErr w:type="spellStart"/>
-      <w:r>
-        <w:rPr>
-          <w:rFonts w:ascii="Aptos" w:eastAsia="Aptos" w:hAnsi="Aptos" w:cs="Aptos"/>
-          <w:b/>
-          <w:bCs/>
-          <w:color w:val="1B1C1D"/>
-        </w:rPr>
-        <w:t>Employee</w:t>
-      </w:r>
-      <w:proofErr w:type="spellEnd"/>
-      <w:r>
-        <w:rPr>
-          <w:rFonts w:ascii="Aptos" w:eastAsia="Aptos" w:hAnsi="Aptos" w:cs="Aptos"/>
-          <w:b/>
-          <w:bCs/>
-          <w:color w:val="1B1C1D"/>
-        </w:rPr>
-        <w:t xml:space="preserve"> Name:</w:t>
-      </w:r>
-      <w:r>
-        <w:rPr>
-          <w:rFonts w:ascii="Aptos" w:eastAsia="Aptos" w:hAnsi="Aptos" w:cs="Aptos"/>
-          <w:color w:val="1B1C1D"/>
-        </w:rPr>
-        <w:t xml:space="preserve"> </w:t>
-      </w:r>
-      <w:r>
-        <w:rPr>
-          <w:rFonts w:ascii="Aptos" w:eastAsia="Aptos" w:hAnsi="Aptos" w:cs="Aptos"/>
-        </w:rPr>
-        <w:t>{{STAFF_NAME}}</w:t>
-      </w:r>
-      <w:r>
-        <w:rPr>
-          <w:rFonts w:ascii="Aptos" w:eastAsia="Aptos" w:hAnsi="Aptos" w:cs="Aptos"/>
-        </w:rPr>
-        <w:tab/>
-      </w:r>
-      <w:r>
-        <w:rPr>
-          <w:rFonts w:ascii="Aptos" w:eastAsia="Aptos" w:hAnsi="Aptos" w:cs="Aptos"/>
-        </w:rPr>
-        <w:br/>
-      </w:r>
-      <w:r>
-        <w:rPr>
-          <w:rFonts w:ascii="Aptos" w:eastAsia="Aptos" w:hAnsi="Aptos" w:cs="Aptos"/>
-          <w:b/>
-          <w:bCs/>
-          <w:color w:val="1B1C1D"/>
-        </w:rPr>
-        <w:t>Employee Signature</w:t>
-      </w:r>
-      <w:r>
-        <w:rPr>
-          <w:rFonts w:ascii="Aptos" w:eastAsia="Aptos" w:hAnsi="Aptos" w:cs="Aptos"/>
-          <w:b/>
-          <w:bCs/>
-          <w:color w:val="1B1C1D"/>
-        </w:rPr>
-        <w:t>:</w:t>
-      </w:r>
-      <w:r>
-        <w:t xml:space="preserve"> </w:t>
-      </w:r>
-      <w:r>
-        <w:br/>
-      </w:r>
-      <w:r>
-        <w:br/>
-      </w:r>
-      <w:r>
-        <w:br/>
-      </w:r>
-      <w:r>
-        <w:rPr>
-          <w:rFonts w:ascii="Aptos" w:eastAsia="Aptos" w:hAnsi="Aptos" w:cs="Aptos"/>
-          <w:b/>
-          <w:bCs/>
-          <w:color w:val="1B1C1D"/>
-        </w:rPr>
-        <w:t xml:space="preserve">Employer </w:t>
-      </w:r>
-      <w:r>
-        <w:rPr>
-          <w:rFonts w:ascii="Aptos" w:eastAsia="Aptos" w:hAnsi="Aptos" w:cs="Aptos"/>
-          <w:b/>
-          <w:bCs/>
-          <w:color w:val="1B1C1D"/>
-        </w:rPr>
-        <w:t>(</w:t>
-      </w:r>
-      <w:r>
-        <w:rPr>
-          <w:rFonts w:ascii="Aptos" w:eastAsia="Aptos" w:hAnsi="Aptos" w:cs="Aptos"/>
-          <w:b/>
-          <w:bCs/>
-          <w:color w:val="1B1C1D"/>
-        </w:rPr>
-        <w:t>{{COMPANY_LEGAL_NAME}}</w:t>
-      </w:r>
-      <w:r>
-        <w:rPr>
-          <w:rFonts w:ascii="Aptos" w:eastAsia="Aptos" w:hAnsi="Aptos" w:cs="Aptos"/>
-          <w:b/>
-          <w:bCs/>
-          <w:color w:val="1B1C1D"/>
-        </w:rPr>
-        <w:t>)</w:t>
-      </w:r>
-      <w:r>
-        <w:rPr>
-          <w:rFonts w:ascii="Aptos" w:eastAsia="Aptos" w:hAnsi="Aptos" w:cs="Aptos"/>
-          <w:b/>
-          <w:bCs/>
-          <w:color w:val="1B1C1D"/>
-        </w:rPr>
-        <w:t xml:space="preserve">, </w:t>
-      </w:r>
-      <w:r>
-        <w:rPr>
-          <w:rFonts w:ascii="Aptos" w:eastAsia="Aptos" w:hAnsi="Aptos" w:cs="Aptos"/>
-          <w:b/>
-          <w:bCs/>
-          <w:color w:val="1B1C1D"/>
-        </w:rPr>
-        <w:t>Represented by:</w:t>
-      </w:r>
-      <w:r>
-        <w:rPr>
-          <w:rFonts w:ascii="Aptos" w:eastAsia="Aptos" w:hAnsi="Aptos" w:cs="Aptos"/>
-          <w:b/>
-          <w:bCs/>
-          <w:color w:val="1B1C1D"/>
-        </w:rPr>
-        <w:br/>
-      </w:r>
-      <w:r>
-        <w:rPr>
-          <w:rFonts w:ascii="Aptos" w:eastAsia="Aptos" w:hAnsi="Aptos" w:cs="Aptos"/>
-          <w:b/>
-          <w:bCs/>
-          <w:color w:val="1B1C1D"/>
-        </w:rPr>
-        <w:t>{{#DIRECTORS}}</w:t>
-      </w:r>
-      <w:r>
-        <w:rPr>
-          <w:rFonts w:ascii="Aptos" w:eastAsia="Aptos" w:hAnsi="Aptos" w:cs="Aptos"/>
-          <w:b/>
-          <w:bCs/>
-          <w:color w:val="1B1C1D"/>
-        </w:rPr>
-        <w:br/>
-      </w:r>
-      <w:r>
-        <w:rPr>
-          <w:rFonts w:ascii="Aptos" w:eastAsia="Aptos" w:hAnsi="Aptos" w:cs="Aptos"/>
-          <w:b/>
-          <w:bCs/>
-          <w:color w:val="1B1C1D"/>
-        </w:rPr>
-        <w:t xml:space="preserve">Director Name: </w:t>
-      </w:r>
-      <w:r>
-        <w:rPr>
-          <w:rFonts w:ascii="Aptos" w:eastAsia="Aptos" w:hAnsi="Aptos" w:cs="Aptos"/>
-          <w:color w:val="1B1C1D"/>
-        </w:rPr>
-        <w:t>{{NAME}}</w:t>
-      </w:r>
-      <w:r>
-        <w:rPr>
-          <w:rFonts w:ascii="Aptos" w:eastAsia="Aptos" w:hAnsi="Aptos" w:cs="Aptos"/>
-          <w:b/>
-          <w:bCs/>
-          <w:color w:val="1B1C1D"/>
-        </w:rPr>
-        <w:br/>
-      </w:r>
-      <w:r>
-        <w:rPr>
-          <w:rFonts w:ascii="Aptos" w:eastAsia="Aptos" w:hAnsi="Aptos" w:cs="Aptos"/>
-          <w:b/>
-          <w:bCs/>
-          <w:color w:val="1B1C1D"/>
-        </w:rPr>
-        <w:lastRenderedPageBreak/>
-        <w:t>Director Signature:</w:t>
-      </w:r>
-      <w:r>
-        <w:t xml:space="preserve"> </w:t>
-      </w:r>
-      <w:r>
-        <w:br/>
-      </w:r>
-      <w:r>
-        <w:br/>
-      </w:r>
-      <w:r>
-        <w:rPr>
-          <w:rFonts w:ascii="Aptos" w:eastAsia="Aptos" w:hAnsi="Aptos" w:cs="Aptos"/>
-          <w:b/>
-          <w:bCs/>
-          <w:color w:val="1B1C1D"/>
-        </w:rPr>
-        <w:t>{{/DIRECTORS}}</w:t>
-      </w:r>
-    </w:p>
-    <w:p>
-      <w:pPr>
-        <w:spacing w:before="240" w:after="240"/>
-        <w:rPr>
-          <w:rFonts w:ascii="Aptos" w:eastAsia="Aptos" w:hAnsi="Aptos" w:cs="Aptos"/>
+          <w:sz w:val="20"/>
+          <w:szCs w:val="20"/>
         </w:rPr>
       </w:pPr>
     </w:p>
     <w:sectPr>
-      <w:headerReference w:type="default" r:id="rId7"/>
-      <w:footerReference w:type="default" r:id="rId8"/>
+      <w:footerReference w:type="default" r:id="rId7"/>
       <w:pgSz w:w="11906" w:h="16838"/>
-      <w:pgMar w:top="540" w:right="1440" w:bottom="1088" w:left="1440" w:header="0" w:footer="720" w:gutter="0"/>
+      <w:pgMar w:top="1440" w:right="1080" w:bottom="1440" w:left="1080" w:header="0" w:footer="90" w:gutter="0"/>
       <w:pgNumType w:start="1"/>
       <w:cols w:space="720"/>
+      <w:docGrid w:linePitch="299"/>
     </w:sectPr>
   </w:body>
 </w:document>
@@ -917,7 +793,7 @@
               <wp:inline distT="0" distB="0" distL="0" distR="0" wp14:anchorId="3F93E3FC" wp14:editId="10B2D6B5">
                 <wp:extent cx="419100" cy="419100"/>
                 <wp:effectExtent l="0" t="0" r="0" b="0"/>
-                <wp:docPr id="1217089645" name="drawing"/>
+                <wp:docPr id="473919563" name="drawing"/>
                 <wp:cNvGraphicFramePr>
                   <a:graphicFrameLocks xmlns:a="http://schemas.openxmlformats.org/drawingml/2006/main" noChangeAspect="1"/>
                 </wp:cNvGraphicFramePr>
@@ -1061,12 +937,6 @@
     </w:p>
   </w:footnote>
 </w:footnotes>
-</file>
-
-<file path=word/header1.xml><?xml version="1.0" encoding="utf-8"?>
-<w:hdr xmlns:wpc="http://schemas.microsoft.com/office/word/2010/wordprocessingCanvas" xmlns:cx="http://schemas.microsoft.com/office/drawing/2014/chartex" xmlns:cx1="http://schemas.microsoft.com/office/drawing/2015/9/8/chartex" xmlns:cx2="http://schemas.microsoft.com/office/drawing/2015/10/21/chartex" xmlns:cx3="http://schemas.microsoft.com/office/drawing/2016/5/9/chartex" xmlns:cx4="http://schemas.microsoft.com/office/drawing/2016/5/10/chartex" xmlns:cx5="http://schemas.microsoft.com/office/drawing/2016/5/11/chartex" xmlns:cx6="http://schemas.microsoft.com/office/drawing/2016/5/12/chartex" xmlns:cx7="http://schemas.microsoft.com/office/drawing/2016/5/13/chartex" xmlns:cx8="http://schemas.microsoft.com/office/drawing/2016/5/14/chartex" xmlns:mc="http://schemas.openxmlformats.org/markup-compatibility/2006" xmlns:aink="http://schemas.microsoft.com/office/drawing/2016/ink" xmlns:am3d="http://schemas.microsoft.com/office/drawing/2017/model3d" xmlns:o="urn:schemas-microsoft-com:office:office" xmlns:oel="http://schemas.microsoft.com/office/2019/extlst" xmlns:r="http://schemas.openxmlformats.org/officeDocument/2006/relationships" xmlns:m="http://schemas.openxmlformats.org/officeDocument/2006/math" xmlns:v="urn:schemas-microsoft-com:vml" xmlns:wp14="http://schemas.microsoft.com/office/word/2010/wordprocessingDrawing" xmlns:wp="http://schemas.openxmlformats.org/drawingml/2006/wordprocessingDrawing" xmlns:w10="urn:schemas-microsoft-com:office:word" xmlns:w="http://schemas.openxmlformats.org/wordprocessingml/2006/main" xmlns:w14="http://schemas.microsoft.com/office/word/2010/wordml" xmlns:w15="http://schemas.microsoft.com/office/word/2012/wordml" xmlns:w16cex="http://schemas.microsoft.com/office/word/2018/wordml/cex" xmlns:w16cid="http://schemas.microsoft.com/office/word/2016/wordml/cid" xmlns:w16="http://schemas.microsoft.com/office/word/2018/wordml" xmlns:w16du="http://schemas.microsoft.com/office/word/2023/wordml/word16du" xmlns:w16sdtdh="http://schemas.microsoft.com/office/word/2020/wordml/sdtdatahash" xmlns:w16sdtfl="http://schemas.microsoft.com/office/word/2024/wordml/sdtformatlock" xmlns:w16se="http://schemas.microsoft.com/office/word/2015/wordml/symex" xmlns:wpg="http://schemas.microsoft.com/office/word/2010/wordprocessingGroup" xmlns:wpi="http://schemas.microsoft.com/office/word/2010/wordprocessingInk" xmlns:wne="http://schemas.microsoft.com/office/word/2006/wordml" xmlns:wps="http://schemas.microsoft.com/office/word/2010/wordprocessingShape" mc:Ignorable="w14 w15 w16se w16cid w16 w16cex w16sdtdh w16sdtfl w16du wp14">
-  <w:p/>
-</w:hdr>
 </file>
 
 <file path=word/intelligence2.xml><?xml version="1.0" encoding="utf-8"?>
@@ -5785,7 +5655,6 @@
     <w:basedOn w:val="Normal"/>
     <w:link w:val="HeaderChar"/>
     <w:uiPriority w:val="99"/>
-    <w:semiHidden/>
     <w:unhideWhenUsed/>
     <w:rsid w:val="008B4B5E"/>
     <w:pPr>
@@ -5800,7 +5669,6 @@
     <w:basedOn w:val="DefaultParagraphFont"/>
     <w:link w:val="Header"/>
     <w:uiPriority w:val="99"/>
-    <w:semiHidden/>
     <w:rsid w:val="008B4B5E"/>
   </w:style>
   <w:style w:type="paragraph" w:styleId="Footer">
@@ -5808,7 +5676,6 @@
     <w:basedOn w:val="Normal"/>
     <w:link w:val="FooterChar"/>
     <w:uiPriority w:val="99"/>
-    <w:semiHidden/>
     <w:unhideWhenUsed/>
     <w:rsid w:val="008B4B5E"/>
     <w:pPr>
@@ -5823,7 +5690,6 @@
     <w:basedOn w:val="DefaultParagraphFont"/>
     <w:link w:val="Footer"/>
     <w:uiPriority w:val="99"/>
-    <w:semiHidden/>
     <w:rsid w:val="008B4B5E"/>
   </w:style>
 </w:styles>

</xml_diff>